<commit_message>
Corrige el orden de los logos y aclara la instalación (v1.11.2)
</commit_message>
<xml_diff>
--- a/Guia-de-uso-skills-RMEI-digital.docx
+++ b/Guia-de-uso-skills-RMEI-digital.docx
@@ -123,7 +123,7 @@
           <w:szCs w:val="24"/>
           <w:lang w:val="es-419"/>
         </w:rPr>
-        <w:t xml:space="preserve">1.11.1</w:t>
+        <w:t xml:space="preserve">1.11.2</w:t>
       </w:r>
     </w:p>
     <w:p>
@@ -153,7 +153,7 @@
           <w:szCs w:val="24"/>
           <w:lang w:val="es-419"/>
         </w:rPr>
-        <w:t xml:space="preserve">8 de septiembre de 2026</w:t>
+        <w:t xml:space="preserve">14 de septiembre de 2026</w:t>
       </w:r>
     </w:p>
     <w:p>
@@ -781,6 +781,39 @@
     </w:p>
     <w:p>
       <w:pPr>
+        <w:pStyle w:val="NormalWeb"/>
+        <w:spacing w:before="0" w:beforeAutospacing="0" w:after="0" w:afterAutospacing="0"/>
+        <w:jc w:val="both"/>
+        <w:rPr>
+          <w:rFonts w:ascii="Calibri" w:hAnsi="Calibri" w:cs="Calibri"/>
+          <w:sz w:val="24"/>
+          <w:szCs w:val="24"/>
+          <w:lang w:val="es-419"/>
+        </w:rPr>
+      </w:pPr>
+      <w:r>
+        <w:rPr>
+          <w:rFonts w:ascii="Calibri" w:hAnsi="Calibri" w:cs="Calibri"/>
+          <w:b/>
+          <w:bCs/>
+          <w:sz w:val="24"/>
+          <w:szCs w:val="24"/>
+          <w:lang w:val="es-419"/>
+        </w:rPr>
+        <w:t xml:space="preserve">Instálalo en los dos ambientes.</w:t>
+      </w:r>
+      <w:r>
+        <w:rPr>
+          <w:rFonts w:ascii="Calibri" w:hAnsi="Calibri" w:cs="Calibri"/>
+          <w:sz w:val="24"/>
+          <w:szCs w:val="24"/>
+          <w:lang w:val="es-419"/>
+        </w:rPr>
+        <w:t xml:space="preserve"> Cowork y Claude Code llevan listas de plugins separadas: agregar el marketplace en uno no lo agrega en el otro, y lo mismo vale para las actualizaciones. Si usas los dos, repite el proceso en cada uno.</w:t>
+      </w:r>
+    </w:p>
+    <w:p>
+      <w:pPr>
         <w:rPr>
           <w:rFonts w:ascii="Calibri" w:hAnsi="Calibri" w:cs="Calibri"/>
           <w:sz w:val="24"/>
@@ -2659,7 +2692,7 @@
           <w:szCs w:val="24"/>
           <w:lang w:val="es-419"/>
         </w:rPr>
-        <w:t xml:space="preserve">Da a un documento de Word el formato institucional completo: logos del BID y de mesoamérica MALARIA en el encabezado, Calibri 12 justificado, secciones numeradas en romanos, viñetas y tablas de encabezado gris.</w:t>
+        <w:t xml:space="preserve">Da a un documento de Word el formato institucional completo: logos de mesoamérica MALARIA y del BID en el encabezado, Calibri 12 justificado, secciones numeradas en romanos, viñetas y tablas de encabezado gris.</w:t>
       </w:r>
     </w:p>
     <w:p>
@@ -4640,68 +4673,6 @@
     </w:pPr>
     <w:r>
       <w:rPr>
-        <w:noProof/>
-      </w:rPr>
-      <w:drawing>
-        <wp:anchor distT="0" distB="0" distL="114300" distR="114300" simplePos="0" relativeHeight="251658241" behindDoc="1" locked="0" layoutInCell="1" allowOverlap="1" wp14:anchorId="5B2B8FFF" wp14:editId="4972109B">
-          <wp:simplePos x="0" y="0"/>
-          <wp:positionH relativeFrom="column">
-            <wp:posOffset>676275</wp:posOffset>
-          </wp:positionH>
-          <wp:positionV relativeFrom="paragraph">
-            <wp:posOffset>-49530</wp:posOffset>
-          </wp:positionV>
-          <wp:extent cx="1047750" cy="324485"/>
-          <wp:effectExtent l="0" t="0" r="0" b="0"/>
-          <wp:wrapTight wrapText="bothSides">
-            <wp:wrapPolygon edited="0">
-              <wp:start x="0" y="0"/>
-              <wp:lineTo x="0" y="20290"/>
-              <wp:lineTo x="21207" y="20290"/>
-              <wp:lineTo x="21207" y="0"/>
-              <wp:lineTo x="0" y="0"/>
-            </wp:wrapPolygon>
-          </wp:wrapTight>
-          <wp:docPr id="756172709" name="Picture 756172709"/>
-          <wp:cNvGraphicFramePr>
-            <a:graphicFrameLocks xmlns:a="http://schemas.openxmlformats.org/drawingml/2006/main" noChangeAspect="1"/>
-          </wp:cNvGraphicFramePr>
-          <a:graphic xmlns:a="http://schemas.openxmlformats.org/drawingml/2006/main">
-            <a:graphicData uri="http://schemas.openxmlformats.org/drawingml/2006/picture">
-              <pic:pic xmlns:pic="http://schemas.openxmlformats.org/drawingml/2006/picture">
-                <pic:nvPicPr>
-                  <pic:cNvPr id="756172709" name=""/>
-                  <pic:cNvPicPr/>
-                </pic:nvPicPr>
-                <pic:blipFill>
-                  <a:blip r:embed="rId1">
-                    <a:extLst>
-                      <a:ext uri="{28A0092B-C50C-407E-A947-70E740481C1C}">
-                        <a14:useLocalDpi xmlns:a14="http://schemas.microsoft.com/office/drawing/2010/main" val="0"/>
-                      </a:ext>
-                    </a:extLst>
-                  </a:blip>
-                  <a:stretch>
-                    <a:fillRect/>
-                  </a:stretch>
-                </pic:blipFill>
-                <pic:spPr>
-                  <a:xfrm>
-                    <a:off x="0" y="0"/>
-                    <a:ext cx="1047750" cy="324485"/>
-                  </a:xfrm>
-                  <a:prstGeom prst="rect">
-                    <a:avLst/>
-                  </a:prstGeom>
-                </pic:spPr>
-              </pic:pic>
-            </a:graphicData>
-          </a:graphic>
-        </wp:anchor>
-      </w:drawing>
-    </w:r>
-    <w:r>
-      <w:rPr>
         <w:rFonts w:cstheme="minorHAnsi"/>
         <w:b/>
         <w:noProof/>
@@ -4715,10 +4686,10 @@
             <wp:posOffset>0</wp:posOffset>
           </wp:positionH>
           <wp:positionV relativeFrom="paragraph">
-            <wp:posOffset>-635</wp:posOffset>
+            <wp:posOffset>-39370</wp:posOffset>
           </wp:positionV>
-          <wp:extent cx="565409" cy="300355"/>
-          <wp:effectExtent l="0" t="0" r="6350" b="4445"/>
+          <wp:extent cx="1724025" cy="328642"/>
+          <wp:effectExtent l="0" t="0" r="0" b="0"/>
           <wp:wrapNone/>
           <wp:docPr id="1809715701" name="Picture 1809715701"/>
           <wp:cNvGraphicFramePr>
@@ -4739,13 +4710,14 @@
                       </a:ext>
                     </a:extLst>
                   </a:blip>
-                  <a:srcRect l="67360"/>
-                  <a:stretch/>
+                  <a:stretch>
+                    <a:fillRect/>
+                  </a:stretch>
                 </pic:blipFill>
                 <pic:spPr bwMode="auto">
                   <a:xfrm>
                     <a:off x="0" y="0"/>
-                    <a:ext cx="565409" cy="300355"/>
+                    <a:ext cx="1724025" cy="328642"/>
                   </a:xfrm>
                   <a:prstGeom prst="rect">
                     <a:avLst/>

</xml_diff>

<commit_message>
Añade las agendas a la tabla de requisitos (v1.11.3)
</commit_message>
<xml_diff>
--- a/Guia-de-uso-skills-RMEI-digital.docx
+++ b/Guia-de-uso-skills-RMEI-digital.docx
@@ -123,7 +123,7 @@
           <w:szCs w:val="24"/>
           <w:lang w:val="es-419"/>
         </w:rPr>
-        <w:t xml:space="preserve">1.11.2</w:t>
+        <w:t xml:space="preserve">1.11.3</w:t>
       </w:r>
     </w:p>
     <w:p>
@@ -153,7 +153,7 @@
           <w:szCs w:val="24"/>
           <w:lang w:val="es-419"/>
         </w:rPr>
-        <w:t xml:space="preserve">14 de septiembre de 2026</w:t>
+        <w:t xml:space="preserve">15 de septiembre de 2026</w:t>
       </w:r>
     </w:p>
     <w:p>
@@ -1527,7 +1527,7 @@
                 <w:szCs w:val="22"/>
                 <w:lang w:val="es-419"/>
               </w:rPr>
-              <w:t xml:space="preserve">Informes de misión y Word</w:t>
+              <w:t xml:space="preserve">Agendas, informes de misión y Word</w:t>
             </w:r>
           </w:p>
         </w:tc>

</xml_diff>

<commit_message>
Documenta el tipo resumen y sube la versión a 1.14.0
</commit_message>
<xml_diff>
--- a/Guia-de-uso-skills-RMEI-digital.docx
+++ b/Guia-de-uso-skills-RMEI-digital.docx
@@ -3137,6 +3137,56 @@
     </w:p>
     <w:p>
       <w:pPr>
+        <w:pStyle w:val="ListParagraph"/>
+        <w:numPr>
+          <w:ilvl w:val="0"/>
+          <w:numId w:val="36"/>
+        </w:numPr>
+        <w:jc w:val="both"/>
+        <w:rPr>
+          <w:rFonts w:ascii="Calibri" w:hAnsi="Calibri" w:cs="Calibri"/>
+          <w:sz w:val="24"/>
+          <w:szCs w:val="24"/>
+          <w:lang w:val="es-419"/>
+        </w:rPr>
+      </w:pPr>
+      <w:r>
+        <w:rPr>
+          <w:rFonts w:ascii="Calibri" w:hAnsi="Calibri" w:cs="Calibri"/>
+          <w:sz w:val="24"/>
+          <w:szCs w:val="24"/>
+          <w:lang w:val="es-419"/>
+        </w:rPr>
+        <w:t xml:space="preserve">«Una presentación resumen de cinco láminas para la reunión de mañana.»</w:t>
+      </w:r>
+    </w:p>
+    <w:p>
+      <w:pPr>
+        <w:pStyle w:val="ListParagraph"/>
+        <w:numPr>
+          <w:ilvl w:val="0"/>
+          <w:numId w:val="36"/>
+        </w:numPr>
+        <w:jc w:val="both"/>
+        <w:rPr>
+          <w:rFonts w:ascii="Calibri" w:hAnsi="Calibri" w:cs="Calibri"/>
+          <w:sz w:val="24"/>
+          <w:szCs w:val="24"/>
+          <w:lang w:val="es-419"/>
+        </w:rPr>
+      </w:pPr>
+      <w:r>
+        <w:rPr>
+          <w:rFonts w:ascii="Calibri" w:hAnsi="Calibri" w:cs="Calibri"/>
+          <w:sz w:val="24"/>
+          <w:szCs w:val="24"/>
+          <w:lang w:val="es-419"/>
+        </w:rPr>
+        <w:t xml:space="preserve">«Corregí el PowerPoint a mano, pasa mis cambios.»</w:t>
+      </w:r>
+    </w:p>
+    <w:p>
+      <w:pPr>
         <w:rPr>
           <w:rFonts w:ascii="Calibri" w:hAnsi="Calibri" w:cs="Calibri"/>
           <w:sz w:val="24"/>
@@ -3508,7 +3558,7 @@
                 <w:szCs w:val="22"/>
                 <w:lang w:val="es-419"/>
               </w:rPr>
-              <w:t xml:space="preserve">Un archivo editable, con las notas en el panel de notas</w:t>
+              <w:t xml:space="preserve">Solo el archivo editable, con las notas en el panel de notas</w:t>
             </w:r>
           </w:p>
         </w:tc>
@@ -3650,6 +3700,92 @@
           <w:lang w:val="es-419"/>
         </w:rPr>
         <w:t xml:space="preserve"> en cuanto alguien más tenga que editarla. La decisión no cierra ninguna puerta: si después piden el editable, es un comando más sobre el mismo archivo. Y dos cosas que conviene decirle, porque cambian el resultado: si va a un ministerio, un donante o un comité, usa la estructura fija de siete secciones; y si la charla lleva demostraciones en vivo, hacen falta la mitad de láminas.</w:t>
+      </w:r>
+    </w:p>
+    <w:p>
+      <w:pPr>
+        <w:rPr>
+          <w:rFonts w:ascii="Calibri" w:hAnsi="Calibri" w:cs="Calibri"/>
+          <w:sz w:val="24"/>
+          <w:szCs w:val="24"/>
+          <w:lang w:val="es-419"/>
+        </w:rPr>
+      </w:pPr>
+    </w:p>
+    <w:p>
+      <w:pPr>
+        <w:pStyle w:val="NormalWeb"/>
+        <w:spacing w:before="0" w:beforeAutospacing="0" w:after="0" w:afterAutospacing="0"/>
+        <w:jc w:val="both"/>
+        <w:rPr>
+          <w:rFonts w:ascii="Calibri" w:hAnsi="Calibri" w:cs="Calibri"/>
+          <w:sz w:val="24"/>
+          <w:szCs w:val="24"/>
+          <w:lang w:val="es-419"/>
+        </w:rPr>
+      </w:pPr>
+      <w:r>
+        <w:rPr>
+          <w:rFonts w:ascii="Calibri" w:hAnsi="Calibri" w:cs="Calibri"/>
+          <w:b/>
+          <w:bCs/>
+          <w:sz w:val="24"/>
+          <w:szCs w:val="24"/>
+          <w:lang w:val="es-419"/>
+        </w:rPr>
+        <w:t xml:space="preserve">Presentación resumen.</w:t>
+      </w:r>
+      <w:r>
+        <w:rPr>
+          <w:rFonts w:ascii="Calibri" w:hAnsi="Calibri" w:cs="Calibri"/>
+          <w:sz w:val="24"/>
+          <w:szCs w:val="24"/>
+          <w:lang w:val="es-419"/>
+        </w:rPr>
+        <w:t xml:space="preserve"> Si pides pocas láminas que se entiendan solas, para una reunión de trabajo o para mandarlas, arma una de entre cuatro y seis láminas sin notas del presentador: contexto con íconos, tablas con todos los bordes, puntos con viñeta verde y los siguientes pasos numerados. Antes te pasa un Word corto con lo que va en pantalla y sus fuentes, para validar el contenido rápido.</w:t>
+      </w:r>
+    </w:p>
+    <w:p>
+      <w:pPr>
+        <w:rPr>
+          <w:rFonts w:ascii="Calibri" w:hAnsi="Calibri" w:cs="Calibri"/>
+          <w:sz w:val="24"/>
+          <w:szCs w:val="24"/>
+          <w:lang w:val="es-419"/>
+        </w:rPr>
+      </w:pPr>
+    </w:p>
+    <w:p>
+      <w:pPr>
+        <w:pStyle w:val="NormalWeb"/>
+        <w:spacing w:before="0" w:beforeAutospacing="0" w:after="0" w:afterAutospacing="0"/>
+        <w:jc w:val="both"/>
+        <w:rPr>
+          <w:rFonts w:ascii="Calibri" w:hAnsi="Calibri" w:cs="Calibri"/>
+          <w:sz w:val="24"/>
+          <w:szCs w:val="24"/>
+          <w:lang w:val="es-419"/>
+        </w:rPr>
+      </w:pPr>
+      <w:r>
+        <w:rPr>
+          <w:rFonts w:ascii="Calibri" w:hAnsi="Calibri" w:cs="Calibri"/>
+          <w:b/>
+          <w:bCs/>
+          <w:sz w:val="24"/>
+          <w:szCs w:val="24"/>
+          <w:lang w:val="es-419"/>
+        </w:rPr>
+        <w:t xml:space="preserve">Si corriges el PowerPoint a mano</w:t>
+      </w:r>
+      <w:r>
+        <w:rPr>
+          <w:rFonts w:ascii="Calibri" w:hAnsi="Calibri" w:cs="Calibri"/>
+          <w:sz w:val="24"/>
+          <w:szCs w:val="24"/>
+          <w:lang w:val="es-419"/>
+        </w:rPr>
+        <w:t xml:space="preserve">, tus cambios mandan: compara tu archivo con el que generó, te dice qué cambiaste y qué resaltaste en amarillo, pasa tus cambios a la fuente y recién ahí vuelve a generar. Tu archivo no lo toca.</w:t>
       </w:r>
     </w:p>
     <w:p>

</xml_diff>